<commit_message>
docs: fix member name
</commit_message>
<xml_diff>
--- a/STACK.docx
+++ b/STACK.docx
@@ -268,14 +268,14 @@
           <w:b w:val="1"/>
           <w:bCs w:val="1"/>
         </w:rPr>
-        <w:t>O</w:t>
+        <w:t>ur</w:t>
       </w:r>
       <w:r>
         <w:rPr>
           <w:b w:val="1"/>
           <w:bCs w:val="1"/>
         </w:rPr>
-        <w:t xml:space="preserve">ur Monteiro, Lucas Tonolli, Rafael Schneider, Willian </w:t>
+        <w:t xml:space="preserve"> Monteiro, Lucas Tonolli, Rafael Schneider, Willian </w:t>
       </w:r>
       <w:r>
         <w:rPr>

</xml_diff>